<commit_message>
Update noc-schengen.docx footer to include contact information for Aldrin Dumigpi, Employee Relations Officer
</commit_message>
<xml_diff>
--- a/Documents Generation/noc-schengen.docx
+++ b/Documents Generation/noc-schengen.docx
@@ -142,13 +142,7 @@
         <w:pStyle w:val="NocBody"/>
       </w:pPr>
       <w:r>
-        <w:t xml:space="preserve">{{worker_name}}, of the {{worker_nationality}} nationality and holder of passport number {{worker_passport}} and Emirates </w:t>
-      </w:r>
-      <w:r>
-        <w:t>ID: {{worker_eid}}, has been employed by Maids.cc since {{employment_start_date}} until the present day, and has an active visa that expires on {{visa_expiry_date}}. {{worker_name}} is assigned to work in the household of {{employer_name}} on a {{employmen</w:t>
-      </w:r>
-      <w:r>
-        <w:t>t_basis}} basis. {{worker_name}} receives a monthly total salary of AED {{monthly_salary}} per month, equivalent to AED {{annual_salary}} per year.</w:t>
+        <w:t>{{worker_name}}, of the {{worker_nationality}} nationality and holder of passport number {{worker_passport}} and Emirates ID: {{worker_eid}}, has been employed by Maids.cc since {{employment_start_date}} until the present day, and has an active visa that expires on {{visa_expiry_date}}. {{worker_name}} is assigned to work in the household of {{employer_name}} on a {{employment_basis}} basis. {{worker_name}} receives a monthly total salary of AED {{monthly_salary}} per month, equivalent to AED {{annual_salary}} per year.</w:t>
       </w:r>
     </w:p>
     <w:p>
@@ -183,10 +177,7 @@
         <w:ind w:left="504"/>
       </w:pPr>
       <w:r>
-        <w:t>- Proposed Travel Dates: {{travel_start_date}} to {{travel_e</w:t>
-      </w:r>
-      <w:r>
-        <w:t>nd_date}}</w:t>
+        <w:t>- Proposed Travel Dates: {{travel_start_date}} to {{travel_end_date}}</w:t>
       </w:r>
     </w:p>
     <w:p>
@@ -233,15 +224,15 @@
         <w:br/>
       </w:r>
       <w:r>
-        <w:t>+</w:t>
-      </w:r>
-      <w:r>
-        <w:t>971 505544143</w:t>
+        <w:t>+971 505544143</w:t>
       </w:r>
       <w:r>
         <w:br/>
       </w:r>
       <w:r>
+        <w:rPr>
+          <w:noProof/>
+        </w:rPr>
         <w:drawing>
           <wp:inline distT="0" distB="0" distL="0" distR="0" wp14:anchorId="039EA7D4" wp14:editId="7899121B">
             <wp:extent cx="1835244" cy="990651"/>
@@ -366,10 +357,7 @@
         <w:bidi/>
       </w:pPr>
       <w:r>
-        <w:t>‏تؤكد شركة ميدز دوت سي سي لخدمات العمالة المساعدة ش.ذ.م.م بأنه ليس لدينا مانع من سفر {{worke</w:t>
-      </w:r>
-      <w:r>
-        <w:t>r_name}} إلى {{destination_country}} مع المرافقين المذكورين أدناه.</w:t>
+        <w:t>‏تؤكد شركة ميدز دوت سي سي لخدمات العمالة المساعدة ش.ذ.م.م بأنه ليس لدينا مانع من سفر {{worker_name}} إلى {{destination_country}} مع المرافقين المذكورين أدناه.</w:t>
       </w:r>
     </w:p>
     <w:p>
@@ -435,13 +423,7 @@
         <w:bidi/>
       </w:pPr>
       <w:r>
-        <w:t xml:space="preserve">‏تم توظيف {{worker_name}} من الجنسية </w:t>
-      </w:r>
-      <w:r>
-        <w:t>{{worker_nationality}} وحاملة رقم جواز السفر {{worker_passport}} والهوية الإماراتية {{worker_eid}}، لدى شركة ميدز دوت سي سي لخدمات العمالة المساعدة ش.ذ.م.م منذ {{employment_start_date}} حتى يومنا هذا وهي بموجب تأشيرة سارية تنتهي في {{visa_expiry_date}}. تم</w:t>
-      </w:r>
-      <w:r>
-        <w:t xml:space="preserve"> تعيين {{worker_name}} للعمل في منزل {{employer_name}} على أساس طويل الأمد. تتقاضى {{worker_name}} راتبًا اجماليًا شهريًا قدره {{monthly_salary}} درهم شهريًا، أي ما يعادل {{annual_salary}} درهم في السنة.</w:t>
+        <w:t>‏تم توظيف {{worker_name}} من الجنسية {{worker_nationality}} وحاملة رقم جواز السفر {{worker_passport}} والهوية الإماراتية {{worker_eid}}، لدى شركة ميدز دوت سي سي لخدمات العمالة المساعدة ش.ذ.م.م منذ {{employment_start_date}} حتى يومنا هذا وهي بموجب تأشيرة سارية تنتهي في {{visa_expiry_date}}. تم تعيين {{worker_name}} للعمل في منزل {{employer_name}} على أساس طويل الأمد. تتقاضى {{worker_name}} راتبًا اجماليًا شهريًا قدره {{monthly_salary}} درهم شهريًا، أي ما يعادل {{annual_salary}} درهم في السنة.</w:t>
       </w:r>
     </w:p>
     <w:p>
@@ -480,10 +462,7 @@
         <w:ind w:right="504"/>
       </w:pPr>
       <w:r>
-        <w:t>- ‏موا</w:t>
-      </w:r>
-      <w:r>
-        <w:t>عيد السفر المتاحة: {{travel_start_date}} الى {{travel_end_date}}</w:t>
+        <w:t>- ‏مواعيد السفر المتاحة: {{travel_start_date}} الى {{travel_end_date}}</w:t>
       </w:r>
     </w:p>
     <w:p>
@@ -521,7 +500,13 @@
         <w:bidi/>
       </w:pPr>
       <w:r>
-        <w:t>‏HR Manager</w:t>
+        <w:t>‏</w:t>
+      </w:r>
+      <w:r>
+        <w:t xml:space="preserve"> </w:t>
+      </w:r>
+      <w:r>
+        <w:t>Aldrin Dumigpi, Employee Relations Officer</w:t>
       </w:r>
     </w:p>
     <w:p>
@@ -531,6 +516,52 @@
       </w:pPr>
       <w:r>
         <w:t>‏⁦+971 505544143⁩</w:t>
+      </w:r>
+      <w:r>
+        <w:rPr>
+          <w:rtl w:val="0"/>
+        </w:rPr>
+        <w:br/>
+      </w:r>
+      <w:r>
+        <w:rPr>
+          <w:noProof/>
+        </w:rPr>
+        <w:drawing>
+          <wp:inline distT="0" distB="0" distL="0" distR="0" wp14:anchorId="66685765" wp14:editId="4BEDBE0B">
+            <wp:extent cx="1835244" cy="990651"/>
+            <wp:effectExtent l="0" t="0" r="0" b="0"/>
+            <wp:docPr id="4" name="Picture 4"/>
+            <wp:cNvGraphicFramePr>
+              <a:graphicFrameLocks xmlns:a="http://schemas.openxmlformats.org/drawingml/2006/main" noChangeAspect="1"/>
+            </wp:cNvGraphicFramePr>
+            <a:graphic xmlns:a="http://schemas.openxmlformats.org/drawingml/2006/main">
+              <a:graphicData uri="http://schemas.openxmlformats.org/drawingml/2006/picture">
+                <pic:pic xmlns:pic="http://schemas.openxmlformats.org/drawingml/2006/picture">
+                  <pic:nvPicPr>
+                    <pic:cNvPr id="1" name=""/>
+                    <pic:cNvPicPr/>
+                  </pic:nvPicPr>
+                  <pic:blipFill>
+                    <a:blip r:embed="rId10"/>
+                    <a:stretch>
+                      <a:fillRect/>
+                    </a:stretch>
+                  </pic:blipFill>
+                  <pic:spPr>
+                    <a:xfrm>
+                      <a:off x="0" y="0"/>
+                      <a:ext cx="1835244" cy="990651"/>
+                    </a:xfrm>
+                    <a:prstGeom prst="rect">
+                      <a:avLst/>
+                    </a:prstGeom>
+                  </pic:spPr>
+                </pic:pic>
+              </a:graphicData>
+            </a:graphic>
+          </wp:inline>
+        </w:drawing>
       </w:r>
     </w:p>
     <w:sectPr>
@@ -580,15 +611,7 @@
         <w:sz w:val="18"/>
         <w:szCs w:val="18"/>
       </w:rPr>
-      <w:t xml:space="preserve">This is an original attested digital </w:t>
-    </w:r>
-    <w:r>
-      <w:rPr>
-        <w:rFonts w:cs="Times New Roman"/>
-        <w:sz w:val="18"/>
-        <w:szCs w:val="18"/>
-      </w:rPr>
-      <w:t>certificate. No other form of this certificate can be generated.</w:t>
+      <w:t>This is an original attested digital certificate. No other form of this certificate can be generated.</w:t>
     </w:r>
   </w:p>
   <w:p>
@@ -602,375 +625,7 @@
         <w:sz w:val="18"/>
         <w:szCs w:val="18"/>
       </w:rPr>
-      <w:t>‏</w:t>
-    </w:r>
-    <w:r>
-      <w:rPr>
-        <w:rFonts w:cs="DejaVu Sans"/>
-        <w:sz w:val="18"/>
-        <w:szCs w:val="18"/>
-      </w:rPr>
-      <w:t>ميدز</w:t>
-    </w:r>
-    <w:r>
-      <w:rPr>
-        <w:rFonts w:cs="DejaVu Sans"/>
-        <w:sz w:val="18"/>
-        <w:szCs w:val="18"/>
-      </w:rPr>
-      <w:t xml:space="preserve"> </w:t>
-    </w:r>
-    <w:r>
-      <w:rPr>
-        <w:rFonts w:cs="DejaVu Sans"/>
-        <w:sz w:val="18"/>
-        <w:szCs w:val="18"/>
-      </w:rPr>
-      <w:t>دوت</w:t>
-    </w:r>
-    <w:r>
-      <w:rPr>
-        <w:rFonts w:cs="DejaVu Sans"/>
-        <w:sz w:val="18"/>
-        <w:szCs w:val="18"/>
-      </w:rPr>
-      <w:t xml:space="preserve"> </w:t>
-    </w:r>
-    <w:r>
-      <w:rPr>
-        <w:rFonts w:cs="DejaVu Sans"/>
-        <w:sz w:val="18"/>
-        <w:szCs w:val="18"/>
-      </w:rPr>
-      <w:t>سي</w:t>
-    </w:r>
-    <w:r>
-      <w:rPr>
-        <w:rFonts w:cs="DejaVu Sans"/>
-        <w:sz w:val="18"/>
-        <w:szCs w:val="18"/>
-      </w:rPr>
-      <w:t xml:space="preserve"> </w:t>
-    </w:r>
-    <w:r>
-      <w:rPr>
-        <w:rFonts w:cs="DejaVu Sans"/>
-        <w:sz w:val="18"/>
-        <w:szCs w:val="18"/>
-      </w:rPr>
-      <w:t>سي،</w:t>
-    </w:r>
-    <w:r>
-      <w:rPr>
-        <w:rFonts w:cs="DejaVu Sans"/>
-        <w:sz w:val="18"/>
-        <w:szCs w:val="18"/>
-      </w:rPr>
-      <w:t xml:space="preserve"> </w:t>
-    </w:r>
-    <w:r>
-      <w:rPr>
-        <w:rFonts w:cs="DejaVu Sans"/>
-        <w:sz w:val="18"/>
-        <w:szCs w:val="18"/>
-      </w:rPr>
-      <w:t>صندوق</w:t>
-    </w:r>
-    <w:r>
-      <w:rPr>
-        <w:rFonts w:cs="DejaVu Sans"/>
-        <w:sz w:val="18"/>
-        <w:szCs w:val="18"/>
-      </w:rPr>
-      <w:t xml:space="preserve"> </w:t>
-    </w:r>
-    <w:r>
-      <w:rPr>
-        <w:rFonts w:cs="DejaVu Sans"/>
-        <w:sz w:val="18"/>
-        <w:szCs w:val="18"/>
-      </w:rPr>
-      <w:t>بريد</w:t>
-    </w:r>
-    <w:r>
-      <w:rPr>
-        <w:rFonts w:cs="DejaVu Sans"/>
-        <w:sz w:val="18"/>
-        <w:szCs w:val="18"/>
-      </w:rPr>
-      <w:t xml:space="preserve"> ⁦P.O. Box 40398⁩</w:t>
-    </w:r>
-    <w:r>
-      <w:rPr>
-        <w:rFonts w:cs="DejaVu Sans"/>
-        <w:sz w:val="18"/>
-        <w:szCs w:val="18"/>
-      </w:rPr>
-      <w:t>،</w:t>
-    </w:r>
-    <w:r>
-      <w:rPr>
-        <w:rFonts w:cs="DejaVu Sans"/>
-        <w:sz w:val="18"/>
-        <w:szCs w:val="18"/>
-      </w:rPr>
-      <w:t xml:space="preserve"> </w:t>
-    </w:r>
-    <w:r>
-      <w:rPr>
-        <w:rFonts w:cs="DejaVu Sans"/>
-        <w:sz w:val="18"/>
-        <w:szCs w:val="18"/>
-      </w:rPr>
-      <w:t>ملك</w:t>
-    </w:r>
-    <w:r>
-      <w:rPr>
-        <w:rFonts w:cs="DejaVu Sans"/>
-        <w:sz w:val="18"/>
-        <w:szCs w:val="18"/>
-      </w:rPr>
-      <w:t xml:space="preserve"> </w:t>
-    </w:r>
-    <w:r>
-      <w:rPr>
-        <w:rFonts w:cs="DejaVu Sans"/>
-        <w:sz w:val="18"/>
-        <w:szCs w:val="18"/>
-      </w:rPr>
-      <w:t>محمد</w:t>
-    </w:r>
-    <w:r>
-      <w:rPr>
-        <w:rFonts w:cs="DejaVu Sans"/>
-        <w:sz w:val="18"/>
-        <w:szCs w:val="18"/>
-      </w:rPr>
-      <w:t xml:space="preserve"> </w:t>
-    </w:r>
-    <w:r>
-      <w:rPr>
-        <w:rFonts w:cs="DejaVu Sans"/>
-        <w:sz w:val="18"/>
-        <w:szCs w:val="18"/>
-      </w:rPr>
-      <w:t>صالح</w:t>
-    </w:r>
-    <w:r>
-      <w:rPr>
-        <w:rFonts w:cs="DejaVu Sans"/>
-        <w:sz w:val="18"/>
-        <w:szCs w:val="18"/>
-      </w:rPr>
-      <w:t xml:space="preserve"> </w:t>
-    </w:r>
-    <w:r>
-      <w:rPr>
-        <w:rFonts w:cs="DejaVu Sans"/>
-        <w:sz w:val="18"/>
-        <w:szCs w:val="18"/>
-      </w:rPr>
-      <w:t>عبدالله</w:t>
-    </w:r>
-    <w:r>
-      <w:rPr>
-        <w:rFonts w:cs="DejaVu Sans"/>
-        <w:sz w:val="18"/>
-        <w:szCs w:val="18"/>
-      </w:rPr>
-      <w:t xml:space="preserve"> </w:t>
-    </w:r>
-    <w:r>
-      <w:rPr>
-        <w:rFonts w:cs="DejaVu Sans"/>
-        <w:sz w:val="18"/>
-        <w:szCs w:val="18"/>
-      </w:rPr>
-      <w:t>ال</w:t>
-    </w:r>
-    <w:r>
-      <w:rPr>
-        <w:rFonts w:cs="DejaVu Sans"/>
-        <w:sz w:val="18"/>
-        <w:szCs w:val="18"/>
-      </w:rPr>
-      <w:t xml:space="preserve"> </w:t>
-    </w:r>
-    <w:r>
-      <w:rPr>
-        <w:rFonts w:cs="DejaVu Sans"/>
-        <w:sz w:val="18"/>
-        <w:szCs w:val="18"/>
-      </w:rPr>
-      <w:t>علي،</w:t>
-    </w:r>
-    <w:r>
-      <w:rPr>
-        <w:rFonts w:cs="DejaVu Sans"/>
-        <w:sz w:val="18"/>
-        <w:szCs w:val="18"/>
-      </w:rPr>
-      <w:t xml:space="preserve"> </w:t>
-    </w:r>
-    <w:r>
-      <w:rPr>
-        <w:rFonts w:cs="DejaVu Sans"/>
-        <w:sz w:val="18"/>
-        <w:szCs w:val="18"/>
-      </w:rPr>
-      <w:t>معرض</w:t>
-    </w:r>
-    <w:r>
-      <w:rPr>
-        <w:rFonts w:cs="DejaVu Sans"/>
-        <w:sz w:val="18"/>
-        <w:szCs w:val="18"/>
-      </w:rPr>
-      <w:t xml:space="preserve"> </w:t>
-    </w:r>
-    <w:r>
-      <w:rPr>
-        <w:rFonts w:cs="DejaVu Sans"/>
-        <w:sz w:val="18"/>
-        <w:szCs w:val="18"/>
-      </w:rPr>
-      <w:t>رقم</w:t>
-    </w:r>
-    <w:r>
-      <w:rPr>
-        <w:rFonts w:cs="DejaVu Sans"/>
-        <w:sz w:val="18"/>
-        <w:szCs w:val="18"/>
-      </w:rPr>
-      <w:t xml:space="preserve"> ⁦1⁩</w:t>
-    </w:r>
-    <w:r>
-      <w:rPr>
-        <w:rFonts w:cs="DejaVu Sans"/>
-        <w:sz w:val="18"/>
-        <w:szCs w:val="18"/>
-      </w:rPr>
-      <w:t>،</w:t>
-    </w:r>
-    <w:r>
-      <w:rPr>
-        <w:rFonts w:cs="DejaVu Sans"/>
-        <w:sz w:val="18"/>
-        <w:szCs w:val="18"/>
-      </w:rPr>
-      <w:t xml:space="preserve"> </w:t>
-    </w:r>
-    <w:r>
-      <w:rPr>
-        <w:rFonts w:cs="DejaVu Sans"/>
-        <w:sz w:val="18"/>
-        <w:szCs w:val="18"/>
-      </w:rPr>
-      <w:t>البرشاء</w:t>
-    </w:r>
-    <w:r>
-      <w:rPr>
-        <w:rFonts w:cs="DejaVu Sans"/>
-        <w:sz w:val="18"/>
-        <w:szCs w:val="18"/>
-      </w:rPr>
-      <w:t xml:space="preserve"> </w:t>
-    </w:r>
-    <w:r>
-      <w:rPr>
-        <w:rFonts w:cs="DejaVu Sans"/>
-        <w:sz w:val="18"/>
-        <w:szCs w:val="18"/>
-      </w:rPr>
-      <w:t>الثانية،</w:t>
-    </w:r>
-    <w:r>
-      <w:rPr>
-        <w:rFonts w:cs="DejaVu Sans"/>
-        <w:sz w:val="18"/>
-        <w:szCs w:val="18"/>
-      </w:rPr>
-      <w:t xml:space="preserve"> </w:t>
-    </w:r>
-    <w:r>
-      <w:rPr>
-        <w:rFonts w:cs="DejaVu Sans"/>
-        <w:sz w:val="18"/>
-        <w:szCs w:val="18"/>
-      </w:rPr>
-      <w:t>الإمارات</w:t>
-    </w:r>
-    <w:r>
-      <w:rPr>
-        <w:rFonts w:cs="DejaVu Sans"/>
-        <w:sz w:val="18"/>
-        <w:szCs w:val="18"/>
-      </w:rPr>
-      <w:t xml:space="preserve"> </w:t>
-    </w:r>
-    <w:r>
-      <w:rPr>
-        <w:rFonts w:cs="DejaVu Sans"/>
-        <w:sz w:val="18"/>
-        <w:szCs w:val="18"/>
-      </w:rPr>
-      <w:t>العربية</w:t>
-    </w:r>
-    <w:r>
-      <w:rPr>
-        <w:rFonts w:cs="DejaVu Sans"/>
-        <w:sz w:val="18"/>
-        <w:szCs w:val="18"/>
-      </w:rPr>
-      <w:t xml:space="preserve"> </w:t>
-    </w:r>
-    <w:r>
-      <w:rPr>
-        <w:rFonts w:cs="DejaVu Sans"/>
-        <w:sz w:val="18"/>
-        <w:szCs w:val="18"/>
-      </w:rPr>
-      <w:t>المتحدة</w:t>
-    </w:r>
-    <w:r>
-      <w:rPr>
-        <w:rFonts w:cs="DejaVu Sans"/>
-        <w:sz w:val="18"/>
-        <w:szCs w:val="18"/>
-      </w:rPr>
-      <w:t xml:space="preserve"> | </w:t>
-    </w:r>
-    <w:r>
-      <w:rPr>
-        <w:rFonts w:cs="DejaVu Sans"/>
-        <w:sz w:val="18"/>
-        <w:szCs w:val="18"/>
-      </w:rPr>
-      <w:t>رقم</w:t>
-    </w:r>
-    <w:r>
-      <w:rPr>
-        <w:rFonts w:cs="DejaVu Sans"/>
-        <w:sz w:val="18"/>
-        <w:szCs w:val="18"/>
-      </w:rPr>
-      <w:t xml:space="preserve"> </w:t>
-    </w:r>
-    <w:r>
-      <w:rPr>
-        <w:rFonts w:cs="DejaVu Sans"/>
-        <w:sz w:val="18"/>
-        <w:szCs w:val="18"/>
-      </w:rPr>
-      <w:t>الاتصال</w:t>
-    </w:r>
-    <w:r>
-      <w:rPr>
-        <w:rFonts w:cs="DejaVu Sans"/>
-        <w:sz w:val="18"/>
-        <w:szCs w:val="18"/>
-      </w:rPr>
-      <w:t>:</w:t>
+      <w:t>‏ميدز دوت سي سي، صندوق بريد ⁦P.O. Box 40398⁩، ملك محمد صالح عبدالله ال علي، معرض رقم ⁦1⁩، البرشاء الثانية، الإمارات العربية المتحدة | رقم الاتصال:</w:t>
     </w:r>
   </w:p>
   <w:p>
@@ -996,31 +651,7 @@
         <w:sz w:val="12"/>
         <w:szCs w:val="12"/>
       </w:rPr>
-      <w:t>This No-Objection Certificate (NO</w:t>
-    </w:r>
-    <w:r>
-      <w:rPr>
-        <w:rFonts w:cs="Times New Roman"/>
-        <w:sz w:val="12"/>
-        <w:szCs w:val="12"/>
-      </w:rPr>
-      <w:t>C) is issued solely for the purpose specified herein and does not imply any legal or financial liability on the part of Maids.cc for any actions, conduct, or obligations of the individual beyond the scope of their designated role as defined by their contra</w:t>
-    </w:r>
-    <w:r>
-      <w:rPr>
-        <w:rFonts w:cs="Times New Roman"/>
-        <w:sz w:val="12"/>
-        <w:szCs w:val="12"/>
-      </w:rPr>
-      <w:t>ctual obligations with Maids.cc. Maids.cc expressly disclaims all liability for any misuse, unauthorized use, or misrepresentation of this certificate. Any such actions are the sole responsibility of the individual and/or their sponsor, regardless of the p</w:t>
-    </w:r>
-    <w:r>
-      <w:rPr>
-        <w:rFonts w:cs="Times New Roman"/>
-        <w:sz w:val="12"/>
-        <w:szCs w:val="12"/>
-      </w:rPr>
-      <w:t>urpose for which the NOC is issued</w:t>
+      <w:t>This No-Objection Certificate (NOC) is issued solely for the purpose specified herein and does not imply any legal or financial liability on the part of Maids.cc for any actions, conduct, or obligations of the individual beyond the scope of their designated role as defined by their contractual obligations with Maids.cc. Maids.cc expressly disclaims all liability for any misuse, unauthorized use, or misrepresentation of this certificate. Any such actions are the sole responsibility of the individual and/or their sponsor, regardless of the purpose for which the NOC is issued</w:t>
     </w:r>
   </w:p>
 </w:ftr>
@@ -1539,11 +1170,6 @@
     <w:lsdException w:name="Book Title" w:uiPriority="33" w:qFormat="1"/>
     <w:lsdException w:name="Bibliography" w:semiHidden="1" w:uiPriority="37" w:unhideWhenUsed="1"/>
     <w:lsdException w:name="TOC Heading" w:semiHidden="1" w:uiPriority="39" w:unhideWhenUsed="1" w:qFormat="1"/>
-    <w:lsdException w:name="Plain Table 5" w:semiHidden="1" w:unhideWhenUsed="1"/>
-    <w:lsdException w:name="Grid Table Light" w:semiHidden="1" w:unhideWhenUsed="1"/>
-    <w:lsdException w:name="Grid Table 1 Light" w:semiHidden="1" w:unhideWhenUsed="1"/>
-    <w:lsdException w:name="Grid Table 2" w:semiHidden="1" w:unhideWhenUsed="1"/>
-    <w:lsdException w:name="Grid Table 3" w:semiHidden="1" w:unhideWhenUsed="1"/>
     <w:lsdException w:name="Grid Table 4" w:uiPriority="49"/>
     <w:lsdException w:name="Grid Table 5 Dark" w:uiPriority="50"/>
     <w:lsdException w:name="Grid Table 6 Colorful" w:uiPriority="51"/>

</xml_diff>

<commit_message>
edit schengen maids NOC footer
</commit_message>
<xml_diff>
--- a/Documents Generation/noc-schengen.docx
+++ b/Documents Generation/noc-schengen.docx
@@ -457,6 +457,48 @@
       </w:r>
       <w:r>
         <w:br/>
+      </w:r>
+      <w:r>
+        <w:rPr>
+          <w:noProof/>
+        </w:rPr>
+        <w:drawing>
+          <wp:inline distT="0" distB="0" distL="0" distR="0" wp14:anchorId="0D3C3BCD" wp14:editId="5ACEE91C">
+            <wp:extent cx="1835150" cy="990600"/>
+            <wp:effectExtent l="0" t="0" r="0" b="0"/>
+            <wp:docPr id="3" name="Picture 3"/>
+            <wp:cNvGraphicFramePr>
+              <a:graphicFrameLocks xmlns:a="http://schemas.openxmlformats.org/drawingml/2006/main" noChangeAspect="1"/>
+            </wp:cNvGraphicFramePr>
+            <a:graphic xmlns:a="http://schemas.openxmlformats.org/drawingml/2006/main">
+              <a:graphicData uri="http://schemas.openxmlformats.org/drawingml/2006/picture">
+                <pic:pic xmlns:pic="http://schemas.openxmlformats.org/drawingml/2006/picture">
+                  <pic:nvPicPr>
+                    <pic:cNvPr id="3" name="Picture 3"/>
+                    <pic:cNvPicPr>
+                      <a:picLocks noChangeAspect="1"/>
+                    </pic:cNvPicPr>
+                  </pic:nvPicPr>
+                  <pic:blipFill>
+                    <a:blip r:embed="rId10"/>
+                    <a:stretch>
+                      <a:fillRect/>
+                    </a:stretch>
+                  </pic:blipFill>
+                  <pic:spPr>
+                    <a:xfrm>
+                      <a:off x="0" y="0"/>
+                      <a:ext cx="1835150" cy="990600"/>
+                    </a:xfrm>
+                    <a:prstGeom prst="rect">
+                      <a:avLst/>
+                    </a:prstGeom>
+                  </pic:spPr>
+                </pic:pic>
+              </a:graphicData>
+            </a:graphic>
+          </wp:inline>
+        </w:drawing>
       </w:r>
     </w:p>
     <w:p>

</xml_diff>

<commit_message>
Update noc-schengen.docx footer to include additional contact information for Aldrin Dumigpi, ensuring consistency with previous updates.
</commit_message>
<xml_diff>
--- a/Documents Generation/noc-schengen.docx
+++ b/Documents Generation/noc-schengen.docx
@@ -441,6 +441,19 @@
     <w:p>
       <w:pPr>
         <w:pStyle w:val="NocBody"/>
+      </w:pPr>
+      <w:r>
+        <w:t>+971 505544143</w:t>
+      </w:r>
+    </w:p>
+    <w:p>
+      <w:pPr>
+        <w:pStyle w:val="NocBody"/>
+      </w:pPr>
+    </w:p>
+    <w:p>
+      <w:pPr>
+        <w:pStyle w:val="NocBody"/>
         <w:sectPr>
           <w:footerReference w:type="default" r:id="rId9"/>
           <w:pgSz w:w="12240" w:h="15840"/>
@@ -449,15 +462,6 @@
           <w:docGrid w:linePitch="360"/>
         </w:sectPr>
       </w:pPr>
-      <w:r>
-        <w:t>+971 505544143</w:t>
-      </w:r>
-      <w:r>
-        <w:br/>
-      </w:r>
-      <w:r>
-        <w:br/>
-      </w:r>
       <w:r>
         <w:rPr>
           <w:noProof/>

</xml_diff>